<commit_message>
Deploy preview for PR  🛫
</commit_message>
<xml_diff>
--- a/pr-preview/pr-11/asymptotic-notation-tracked-changes.docx
+++ b/pr-preview/pr-11/asymptotic-notation-tracked-changes.docx
@@ -16,7 +16,7 @@
       </w:pPr>
       <w:del w:id="1" w:author="PR Preview" w:date="2026-01-01T00:00:00Z">
         <w:r>
-          <w:delText xml:space="preserve">Last modified: 2026-10-14 01:53:58 (PDT)</w:delText>
+          <w:delText xml:space="preserve">Last modified: 2026-10-14 11:35:33 (PDT)</w:delText>
         </w:r>
       </w:del>
     </w:p>
@@ -26,7 +26,7 @@
       </w:pPr>
       <w:ins w:id="2" w:author="PR Preview" w:date="2026-01-01T00:00:00Z">
         <w:r>
-          <w:t xml:space="preserve">Last modified: 2026-10-14 11:03:27 (PDT)</w:t>
+          <w:t xml:space="preserve">Last modified: 2026-10-14 11:42:40 (PDT)</w:t>
         </w:r>
       </w:ins>
     </w:p>

</xml_diff>